<commit_message>
update: product proposal with links, fix API key leak
Co-Authored-By: Claude Opus 4.7 <noreply@anthropic.com>
</commit_message>
<xml_diff>
--- a/public/无界文档-产品方案.docx
+++ b/public/无界文档-产品方案.docx
@@ -104,22 +104,65 @@
           <w:sz w:val="22"/>
           <w:szCs w:val="22"/>
         </w:rPr>
-        <w:t xml:space="preserve">版本 1.0</w:t>
-      </w:r>
-    </w:p>
-    <w:p>
-      <w:pPr>
-        <w:spacing w:after="100"/>
+        <w:t xml:space="preserve">版本 1.0 · 2026 年 5 月</w:t>
+      </w:r>
+    </w:p>
+    <w:p>
+      <w:pPr>
+        <w:spacing w:before="400"/>
         <w:jc w:val="center"/>
       </w:pPr>
-      <w:r>
-        <w:rPr>
-          <w:rFonts w:ascii="微软雅黑" w:cs="微软雅黑" w:eastAsia="微软雅黑" w:hAnsi="微软雅黑"/>
-          <w:color w:val="8B8D98"/>
+    </w:p>
+    <w:p>
+      <w:pPr>
+        <w:spacing w:after="60"/>
+        <w:jc w:val="center"/>
+      </w:pPr>
+      <w:r>
+        <w:rPr>
+          <w:rFonts w:ascii="微软雅黑" w:cs="微软雅黑" w:eastAsia="微软雅黑" w:hAnsi="微软雅黑"/>
+          <w:b/>
+          <w:bCs/>
+          <w:color w:val="555555"/>
           <w:sz w:val="22"/>
           <w:szCs w:val="22"/>
         </w:rPr>
-        <w:t xml:space="preserve">2026 年 5 月</w:t>
+        <w:t xml:space="preserve">在线体验：</w:t>
+      </w:r>
+      <w:r>
+        <w:rPr>
+          <w:rFonts w:ascii="Consolas" w:cs="Consolas" w:eastAsia="Consolas" w:hAnsi="Consolas"/>
+          <w:color w:val="6C63FF"/>
+          <w:sz w:val="20"/>
+          <w:szCs w:val="20"/>
+        </w:rPr>
+        <w:t xml:space="preserve">https://pigeon-soft.github.io/boundless-doc/</w:t>
+      </w:r>
+    </w:p>
+    <w:p>
+      <w:pPr>
+        <w:spacing w:after="60"/>
+        <w:jc w:val="center"/>
+      </w:pPr>
+      <w:r>
+        <w:rPr>
+          <w:rFonts w:ascii="微软雅黑" w:cs="微软雅黑" w:eastAsia="微软雅黑" w:hAnsi="微软雅黑"/>
+          <w:b/>
+          <w:bCs/>
+          <w:color w:val="555555"/>
+          <w:sz w:val="22"/>
+          <w:szCs w:val="22"/>
+        </w:rPr>
+        <w:t xml:space="preserve">开源仓库：</w:t>
+      </w:r>
+      <w:r>
+        <w:rPr>
+          <w:rFonts w:ascii="Consolas" w:cs="Consolas" w:eastAsia="Consolas" w:hAnsi="Consolas"/>
+          <w:color w:val="6C63FF"/>
+          <w:sz w:val="20"/>
+          <w:szCs w:val="20"/>
+        </w:rPr>
+        <w:t xml:space="preserve">https://github.com/PIGEON-SOFT/boundless-doc</w:t>
       </w:r>
     </w:p>
     <w:p>
@@ -386,7 +429,22 @@
           <w:sz w:val="21"/>
           <w:szCs w:val="21"/>
         </w:rPr>
-        <w:t xml:space="preserve">核心理念：文档不应只是信息的载体，更应是交互、执行和智能分析的平台。</w:t>
+        <w:t xml:space="preserve">在线体验地址：https://pigeon-soft.github.io/boundless-doc/</w:t>
+      </w:r>
+    </w:p>
+    <w:p>
+      <w:pPr>
+        <w:spacing w:after="80" w:before="80"/>
+        <w:jc w:val="both"/>
+      </w:pPr>
+      <w:r>
+        <w:rPr>
+          <w:rFonts w:ascii="微软雅黑" w:cs="微软雅黑" w:eastAsia="微软雅黑" w:hAnsi="微软雅黑"/>
+          <w:color w:val="333333"/>
+          <w:sz w:val="21"/>
+          <w:szCs w:val="21"/>
+        </w:rPr>
+        <w:t xml:space="preserve">开源项目地址：https://github.com/PIGEON-SOFT/boundless-doc</w:t>
       </w:r>
     </w:p>
     <w:p>
@@ -458,7 +516,7 @@
           <w:sz w:val="21"/>
           <w:szCs w:val="21"/>
         </w:rPr>
-        <w:t xml:space="preserve">表格数据一旦写入文档便成为"死数据"，无法动态更新。读者只能看到某个时间点的快照，无法感知数据的变化趋势。例如，季度销售报表中的数据在文档生成后即过时，读者无法获取最新情况。</w:t>
+        <w:t xml:space="preserve">表格数据一旦写入文档便成为"死数据"，无法动态更新。读者只能看到某个时间点的快照，无法感知数据的变化趋势。</w:t>
       </w:r>
     </w:p>
     <w:p>
@@ -490,7 +548,7 @@
           <w:sz w:val="21"/>
           <w:szCs w:val="21"/>
         </w:rPr>
-        <w:t xml:space="preserve">传统图表仅以静态图片形式嵌入，不支持缩放、筛选、切换视图等操作。用户若想查看不同维度的数据，需要重新制作图表并替换。</w:t>
+        <w:t xml:space="preserve">传统图表仅以静态图片形式嵌入，不支持缩放、筛选、切换视图等操作。</w:t>
       </w:r>
     </w:p>
     <w:p>
@@ -522,7 +580,7 @@
           <w:sz w:val="21"/>
           <w:szCs w:val="21"/>
         </w:rPr>
-        <w:t xml:space="preserve">技术文档中的代码片段只能以纯文本形式展示，读者若想运行或验证，需要手动复制到本地环境，增加了认知负担和操作成本。</w:t>
+        <w:t xml:space="preserve">技术文档中的代码片段只能以纯文本展示，读者若想运行验证，需手动复制到本地环境。</w:t>
       </w:r>
     </w:p>
     <w:p>
@@ -554,7 +612,7 @@
           <w:sz w:val="21"/>
           <w:szCs w:val="21"/>
         </w:rPr>
-        <w:t xml:space="preserve">传统文档无法提供智能问答。读者遇到不理解的内容时，需要借助外部工具搜索或咨询他人，阅读效率低。</w:t>
+        <w:t xml:space="preserve">传统文档无法提供智能问答，读者遇到不理解的内容时需要借助外部工具。</w:t>
       </w:r>
     </w:p>
     <w:p>
@@ -586,7 +644,7 @@
           <w:sz w:val="21"/>
           <w:szCs w:val="21"/>
         </w:rPr>
-        <w:t xml:space="preserve">复杂数据和模型（如三维结构、实时监控数据）难以在平面文档中有效呈现，限制了文档的表达力。</w:t>
+        <w:t xml:space="preserve">三维结构、实时监控数据等难以在平面文档中有效呈现。</w:t>
       </w:r>
     </w:p>
     <w:p>
@@ -643,7 +701,7 @@
           <w:sz w:val="21"/>
           <w:szCs w:val="21"/>
         </w:rPr>
-        <w:t xml:space="preserve">无界文档定位为"智能文档增强平台"，面向需要将静态文档升级为交互式体验的用户群体，包括但不限于：数据分析师、产品经理、技术写作者、教育工作者和科研人员。</w:t>
+        <w:t xml:space="preserve">无界文档定位为"智能文档增强平台"，面向需要将静态文档升级为交互式体验的用户群体，包括数据分析师、产品经理、技术写作者、教育工作者和科研人员。</w:t>
       </w:r>
     </w:p>
     <w:p>
@@ -692,7 +750,7 @@
           <w:sz w:val="22"/>
           <w:szCs w:val="22"/>
         </w:rPr>
-        <w:t xml:space="preserve">3.3 核心价值主张</w:t>
+        <w:t xml:space="preserve">3.3 核心价值</w:t>
       </w:r>
     </w:p>
     <w:p>
@@ -768,7 +826,7 @@
           <w:sz w:val="21"/>
           <w:szCs w:val="21"/>
         </w:rPr>
-        <w:t xml:space="preserve">无缝集成：同时支持 Web 端和 Word 插件两种使用方式。</w:t>
+        <w:t xml:space="preserve">无缝集成：同时支持 Web 端和 Word 插件。</w:t>
       </w:r>
     </w:p>
     <w:p>
@@ -787,7 +845,7 @@
           <w:sz w:val="21"/>
           <w:szCs w:val="21"/>
         </w:rPr>
-        <w:t xml:space="preserve">多维表达：3D 模型展示，突破二维平面的限制。</w:t>
+        <w:t xml:space="preserve">多维表达：3D 模型展示，突破二维平面限制。</w:t>
       </w:r>
     </w:p>
     <w:p>
@@ -827,7 +885,7 @@
           <w:sz w:val="21"/>
           <w:szCs w:val="21"/>
         </w:rPr>
-        <w:t xml:space="preserve">无界文档采用"块"（Block）架构，每个功能以独立块的形式呈现，支持自由组合与排列。以下为六大核心功能模块：</w:t>
+        <w:t xml:space="preserve">无界文档采用"块"（Block）架构，每个功能以独立块的形式呈现，支持自由组合与排列。</w:t>
       </w:r>
     </w:p>
     <w:tbl>
@@ -853,7 +911,6 @@
         </w:trPr>
         <w:tc>
           <w:tcPr>
-            <w:tcW w:type="dxa" w:w="800"/>
             <w:shd w:fill="6C63FF" w:val="clear"/>
           </w:tcPr>
           <w:p>
@@ -862,6 +919,7 @@
             </w:pPr>
             <w:r>
               <w:rPr>
+                <w:rFonts w:ascii="微软雅黑" w:cs="微软雅黑" w:eastAsia="微软雅黑" w:hAnsi="微软雅黑"/>
                 <w:b/>
                 <w:bCs/>
                 <w:color w:val="FFFFFF"/>
@@ -874,10 +932,12 @@
         </w:tc>
         <w:tc>
           <w:tcPr>
-            <w:tcW w:type="dxa" w:w="2500"/>
             <w:shd w:fill="6C63FF" w:val="clear"/>
           </w:tcPr>
           <w:p>
+            <w:pPr>
+              <w:jc w:val="center"/>
+            </w:pPr>
             <w:r>
               <w:rPr>
                 <w:rFonts w:ascii="微软雅黑" w:cs="微软雅黑" w:eastAsia="微软雅黑" w:hAnsi="微软雅黑"/>
@@ -893,10 +953,12 @@
         </w:tc>
         <w:tc>
           <w:tcPr>
-            <w:tcW w:type="dxa" w:w="6000"/>
             <w:shd w:fill="6C63FF" w:val="clear"/>
           </w:tcPr>
           <w:p>
+            <w:pPr>
+              <w:jc w:val="center"/>
+            </w:pPr>
             <w:r>
               <w:rPr>
                 <w:rFonts w:ascii="微软雅黑" w:cs="微软雅黑" w:eastAsia="微软雅黑" w:hAnsi="微软雅黑"/>
@@ -962,7 +1024,7 @@
                 <w:sz w:val="21"/>
                 <w:szCs w:val="21"/>
               </w:rPr>
-              <w:t xml:space="preserve">支持富文本内容展示，作为文档的基础内容单元，可与其他块自由穿插组合。</w:t>
+              <w:t xml:space="preserve">富文本内容展示，作为文档的基础内容单元。</w:t>
             </w:r>
           </w:p>
         </w:tc>
@@ -1018,7 +1080,7 @@
                 <w:sz w:val="21"/>
                 <w:szCs w:val="21"/>
               </w:rPr>
-              <w:t xml:space="preserve">支持 JavaScript 和 Python 两种语言。JavaScript 通过浏览器沙箱直接执行，Python 通过 Pyodide 在浏览器端运行。用户可直接在文档中编写、修改、运行代码并查看输出结果，实现"文档即 Playground"的理念。</w:t>
+              <w:t xml:space="preserve">支持 JavaScript 和 Python 双语言。JS 通过浏览器沙箱执行，Python 通过 Pyodide（WebAssembly）在浏览器端运行。用户可直接编写、修改、运行代码并查看输出，实现"文档即 Playground"。</w:t>
             </w:r>
           </w:p>
         </w:tc>
@@ -1074,7 +1136,7 @@
                 <w:sz w:val="21"/>
                 <w:szCs w:val="21"/>
               </w:rPr>
-              <w:t xml:space="preserve">将 .docx 中的表格数据自动转化为 ECharts 可交互图表，支持折线图、柱状图、饼图、散点图等多种类型。用户可缩放、筛选、切换图表类型，所有图表采用暗色主题统一设计。</w:t>
+              <w:t xml:space="preserve">表格数据自动转化为 ECharts 可交互图表，支持折线图、柱状图、饼图、散点图，暗色主题统一设计。</w:t>
             </w:r>
           </w:p>
         </w:tc>
@@ -1130,7 +1192,7 @@
                 <w:sz w:val="21"/>
                 <w:szCs w:val="21"/>
               </w:rPr>
-              <w:t xml:space="preserve">对接云端公开 API 实现数据实时更新。内置多个预设数据源（加密货币行情、天气预报、BTC 价格走势），支持自定义 JSON API 地址，可配置刷新间隔（10秒至5分钟），数据实时渲染为可交互图表。</w:t>
+              <w:t xml:space="preserve">对接云端公开 API 实时更新。内置加密货币行情、天气预报、BTC 价格等预设，支持自定义 API，可配置刷新间隔。</w:t>
             </w:r>
           </w:p>
         </w:tc>
@@ -1186,7 +1248,7 @@
                 <w:sz w:val="21"/>
                 <w:szCs w:val="21"/>
               </w:rPr>
-              <w:t xml:space="preserve">基于 Three.js 实现三维模型实时渲染。支持立方体、球体、圆环、圆柱、圆锥、环面纽结等多种几何体，支持鼠标拖拽旋转、触摸操作，自动旋转动画，多种配色方案可选。</w:t>
+              <w:t xml:space="preserve">基于 Three.js 实时渲染。支持立方体、球体、圆环、圆柱、圆锥、环面纽结等几何体，鼠标拖拽旋转，自动旋转动画。</w:t>
             </w:r>
           </w:p>
         </w:tc>
@@ -1242,7 +1304,7 @@
                 <w:sz w:val="21"/>
                 <w:szCs w:val="21"/>
               </w:rPr>
-              <w:t xml:space="preserve">集成 DeepSeek 大语言模型，构建基于全文档上下文的智能问答系统。AI 自动汇总文档中所有块的内容作为上下文，用户可针对文档内容提问、要求总结、请求分析建议等。</w:t>
+              <w:t xml:space="preserve">集成 DeepSeek 大语言模型，自动汇总全文上下文，用户可针对文档内容提问、请求总结和分析建议。</w:t>
             </w:r>
           </w:p>
         </w:tc>
@@ -1263,21 +1325,6 @@
           <w:szCs w:val="26"/>
         </w:rPr>
         <w:t xml:space="preserve">4.1 Word 插件深度集成</w:t>
-      </w:r>
-    </w:p>
-    <w:p>
-      <w:pPr>
-        <w:spacing w:after="80" w:before="80"/>
-        <w:jc w:val="both"/>
-      </w:pPr>
-      <w:r>
-        <w:rPr>
-          <w:rFonts w:ascii="微软雅黑" w:cs="微软雅黑" w:eastAsia="微软雅黑" w:hAnsi="微软雅黑"/>
-          <w:color w:val="333333"/>
-          <w:sz w:val="21"/>
-          <w:szCs w:val="21"/>
-        </w:rPr>
-        <w:t xml:space="preserve">无界文档作为 Microsoft Word 官方插件（Office Add-in）运行，实现了以下深度集成功能：</w:t>
       </w:r>
     </w:p>
     <w:p>
@@ -1315,7 +1362,7 @@
           <w:sz w:val="21"/>
           <w:szCs w:val="21"/>
         </w:rPr>
-        <w:t xml:space="preserve">表格联动：点击 Word 文档中的表格，侧边栏自动跳转到对应的增强图表，实现原文与增强视图的无缝对照。</w:t>
+        <w:t xml:space="preserve">表格联动：点击 Word 中的表格，侧边栏自动跳转到对应图表。</w:t>
       </w:r>
     </w:p>
     <w:p>
@@ -1334,7 +1381,7 @@
           <w:sz w:val="21"/>
           <w:szCs w:val="21"/>
         </w:rPr>
-        <w:t xml:space="preserve">图表回写：实时数据图表可一键同步到 Word 文档中，以高清图片形式插入。</w:t>
+        <w:t xml:space="preserve">图表回写：实时数据图表可一键同步到 Word 文档。</w:t>
       </w:r>
     </w:p>
     <w:p>
@@ -1353,7 +1400,7 @@
           <w:sz w:val="21"/>
           <w:szCs w:val="21"/>
         </w:rPr>
-        <w:t xml:space="preserve">增量增强：用户可随时添加新的代码块、图表块、AI 块等，在侧边栏中构建完整的增强视图。</w:t>
+        <w:t xml:space="preserve">增量增强：随时添加代码块、图表块、AI 块等。</w:t>
       </w:r>
     </w:p>
     <w:p>
@@ -1410,7 +1457,7 @@
           <w:sz w:val="21"/>
           <w:szCs w:val="21"/>
         </w:rPr>
-        <w:t xml:space="preserve">无界文档采用前后端分离的纯前端架构，所有计算均在浏览器端完成，无需部署后端服务。AI 功能通过调用 DeepSeek 云端 API 实现。</w:t>
+        <w:t xml:space="preserve">采用纯前端架构，所有计算在浏览器端完成，无需后端服务。AI 功能通过调用 DeepSeek 云端 API 实现。</w:t>
       </w:r>
     </w:p>
     <w:p>
@@ -1452,12 +1499,12 @@
         </w:trPr>
         <w:tc>
           <w:tcPr>
-            <w:tcW w:type="dxa" w:w="3000"/>
             <w:shd w:fill="6C63FF" w:val="clear"/>
           </w:tcPr>
           <w:p>
             <w:r>
               <w:rPr>
+                <w:rFonts w:ascii="微软雅黑" w:cs="微软雅黑" w:eastAsia="微软雅黑" w:hAnsi="微软雅黑"/>
                 <w:b/>
                 <w:bCs/>
                 <w:color w:val="FFFFFF"/>
@@ -1470,7 +1517,6 @@
         </w:tc>
         <w:tc>
           <w:tcPr>
-            <w:tcW w:type="dxa" w:w="6300"/>
             <w:shd w:fill="6C63FF" w:val="clear"/>
           </w:tcPr>
           <w:p>
@@ -1557,7 +1603,7 @@
                 <w:sz w:val="20"/>
                 <w:szCs w:val="20"/>
               </w:rPr>
-              <w:t xml:space="preserve">构建工具，支持 HTTPS 开发服务器与 HMR 热更新</w:t>
+              <w:t xml:space="preserve">构建工具，支持 HTTPS 开发服务器与 HMR</w:t>
             </w:r>
           </w:p>
         </w:tc>
@@ -1594,7 +1640,7 @@
                 <w:sz w:val="20"/>
                 <w:szCs w:val="20"/>
               </w:rPr>
-              <w:t xml:space="preserve">可交互图表渲染引擎，支持折线/柱状/饼图/散点图</w:t>
+              <w:t xml:space="preserve">可交互图表渲染引擎</w:t>
             </w:r>
           </w:p>
         </w:tc>
@@ -1631,7 +1677,7 @@
                 <w:sz w:val="20"/>
                 <w:szCs w:val="20"/>
               </w:rPr>
-              <w:t xml:space="preserve">WebGL 3D 渲染引擎，实现几何体实时渲染与交互</w:t>
+              <w:t xml:space="preserve">WebGL 3D 渲染引擎</w:t>
             </w:r>
           </w:p>
         </w:tc>
@@ -1668,7 +1714,7 @@
                 <w:sz w:val="20"/>
                 <w:szCs w:val="20"/>
               </w:rPr>
-              <w:t xml:space="preserve">浏览器端 Python 运行时，通过 WebAssembly 执行 Python 代码</w:t>
+              <w:t xml:space="preserve">浏览器端 Python 运行时（WebAssembly）</w:t>
             </w:r>
           </w:p>
         </w:tc>
@@ -1705,7 +1751,7 @@
                 <w:sz w:val="20"/>
                 <w:szCs w:val="20"/>
               </w:rPr>
-              <w:t xml:space="preserve">.docx 文件解析，提取文本、表格和结构信息</w:t>
+              <w:t xml:space="preserve">.docx 文件解析</w:t>
             </w:r>
           </w:p>
         </w:tc>
@@ -1726,7 +1772,7 @@
                 <w:sz w:val="20"/>
                 <w:szCs w:val="20"/>
               </w:rPr>
-              <w:t xml:space="preserve">docx (npm)</w:t>
+              <w:t xml:space="preserve">Office.js</w:t>
             </w:r>
           </w:p>
         </w:tc>
@@ -1742,7 +1788,7 @@
                 <w:sz w:val="20"/>
                 <w:szCs w:val="20"/>
               </w:rPr>
-              <w:t xml:space="preserve">.docx 文件程序化生成，用于演示文档和产品方案的创建</w:t>
+              <w:t xml:space="preserve">Microsoft Office Add-in SDK</w:t>
             </w:r>
           </w:p>
         </w:tc>
@@ -1763,7 +1809,7 @@
                 <w:sz w:val="20"/>
                 <w:szCs w:val="20"/>
               </w:rPr>
-              <w:t xml:space="preserve">Office.js</w:t>
+              <w:t xml:space="preserve">DeepSeek API</w:t>
             </w:r>
           </w:p>
         </w:tc>
@@ -1779,81 +1825,7 @@
                 <w:sz w:val="20"/>
                 <w:szCs w:val="20"/>
               </w:rPr>
-              <w:t xml:space="preserve">Microsoft Office Add-in SDK，实现 Word 深度集成</w:t>
-            </w:r>
-          </w:p>
-        </w:tc>
-      </w:tr>
-      <w:tr>
-        <w:tc>
-          <w:tcPr>
-            <w:tcW w:type="dxa" w:w="3000"/>
-            <w:shd w:fill="F5F5FF" w:val="clear"/>
-          </w:tcPr>
-          <w:p>
-            <w:r>
-              <w:rPr>
-                <w:rFonts w:ascii="Consolas" w:cs="Consolas" w:eastAsia="Consolas" w:hAnsi="Consolas"/>
-                <w:b/>
-                <w:bCs/>
-                <w:color w:val="6C63FF"/>
-                <w:sz w:val="20"/>
-                <w:szCs w:val="20"/>
-              </w:rPr>
-              <w:t xml:space="preserve">DeepSeek API</w:t>
-            </w:r>
-          </w:p>
-        </w:tc>
-        <w:tc>
-          <w:tcPr>
-            <w:tcW w:type="dxa" w:w="6300"/>
-          </w:tcPr>
-          <w:p>
-            <w:r>
-              <w:rPr>
-                <w:rFonts w:ascii="微软雅黑" w:cs="微软雅黑" w:eastAsia="微软雅黑" w:hAnsi="微软雅黑"/>
-                <w:color w:val="555555"/>
-                <w:sz w:val="20"/>
-                <w:szCs w:val="20"/>
-              </w:rPr>
-              <w:t xml:space="preserve">大语言模型接口，提供文档级上下文的 AI 问答能力</w:t>
-            </w:r>
-          </w:p>
-        </w:tc>
-      </w:tr>
-      <w:tr>
-        <w:tc>
-          <w:tcPr>
-            <w:tcW w:type="dxa" w:w="3000"/>
-            <w:shd w:fill="F5F5FF" w:val="clear"/>
-          </w:tcPr>
-          <w:p>
-            <w:r>
-              <w:rPr>
-                <w:rFonts w:ascii="Consolas" w:cs="Consolas" w:eastAsia="Consolas" w:hAnsi="Consolas"/>
-                <w:b/>
-                <w:bCs/>
-                <w:color w:val="6C63FF"/>
-                <w:sz w:val="20"/>
-                <w:szCs w:val="20"/>
-              </w:rPr>
-              <w:t xml:space="preserve">office-addin-dev-certs</w:t>
-            </w:r>
-          </w:p>
-        </w:tc>
-        <w:tc>
-          <w:tcPr>
-            <w:tcW w:type="dxa" w:w="6300"/>
-          </w:tcPr>
-          <w:p>
-            <w:r>
-              <w:rPr>
-                <w:rFonts w:ascii="微软雅黑" w:cs="微软雅黑" w:eastAsia="微软雅黑" w:hAnsi="微软雅黑"/>
-                <w:color w:val="555555"/>
-                <w:sz w:val="20"/>
-                <w:szCs w:val="20"/>
-              </w:rPr>
-              <w:t xml:space="preserve">Office 插件开发证书管理，确保 HTTPS 安全连接</w:t>
+              <w:t xml:space="preserve">大语言模型接口，文档级上下文 AI 问答</w:t>
             </w:r>
           </w:p>
         </w:tc>
@@ -1890,7 +1862,7 @@
           <w:sz w:val="22"/>
           <w:szCs w:val="22"/>
         </w:rPr>
-        <w:t xml:space="preserve">5.3.1 块（Block）架构</w:t>
+        <w:t xml:space="preserve">块（Block）架构</w:t>
       </w:r>
     </w:p>
     <w:p>
@@ -1905,7 +1877,7 @@
           <w:sz w:val="21"/>
           <w:szCs w:val="21"/>
         </w:rPr>
-        <w:t xml:space="preserve">文档由多个独立的功能"块"组成，每个块具有统一的接口（id、type、content、output）。块之间松耦合，可自由组合、排序、增删。这种设计使得功能扩展极为灵活——新增一种块类型只需实现对应的 React 组件即可。</w:t>
+        <w:t xml:space="preserve">文档由多个独立功能"块"组成，每个块具有统一接口（id、type、content、output）。块之间松耦合，可自由组合排序增删。新增块类型只需实现对应 React 组件。</w:t>
       </w:r>
     </w:p>
     <w:p>
@@ -1922,7 +1894,7 @@
           <w:sz w:val="22"/>
           <w:szCs w:val="22"/>
         </w:rPr>
-        <w:t xml:space="preserve">5.3.2 双模式运行</w:t>
+        <w:t xml:space="preserve">双模式运行</w:t>
       </w:r>
     </w:p>
     <w:p>
@@ -1937,7 +1909,7 @@
           <w:sz w:val="21"/>
           <w:szCs w:val="21"/>
         </w:rPr>
-        <w:t xml:space="preserve">系统自动检测运行环境：若在 Word 插件宿主中，切换为 Add-in 模式（精简布局、Office API 集成）；否则以独立 Web 应用模式运行（完整功能、文件上传入口）。两种模式共享相同的块渲染引擎和核心逻辑。</w:t>
+        <w:t xml:space="preserve">自动检测环境：Word 插件宿主中切换为 Add-in 模式；否则以 Web 应用模式运行。两种模式共享相同的块渲染引擎。</w:t>
       </w:r>
     </w:p>
     <w:p>
@@ -1954,7 +1926,7 @@
           <w:sz w:val="22"/>
           <w:szCs w:val="22"/>
         </w:rPr>
-        <w:t xml:space="preserve">5.3.3 数据流</w:t>
+        <w:t xml:space="preserve">数据流</w:t>
       </w:r>
     </w:p>
     <w:p>
@@ -1969,7 +1941,7 @@
           <w:sz w:val="21"/>
           <w:szCs w:val="21"/>
         </w:rPr>
-        <w:t xml:space="preserve">.docx 文件 → mammoth.js 解析 → 识别表格/文本结构 → 转化为 Block 数组 → React 组件渲染增强视图。对于 Word 插件，额外通过 Office.js API 直接读取文档内容，并支持选区监听实现表格联动。</w:t>
+        <w:t xml:space="preserve">.docx → mammoth.js 解析 → 识别表格/文本 → Block 数组 → React 渲染增强视图。Word 插件额外通过 Office.js 直接读取文档，支持选区监听实现表格联动。</w:t>
       </w:r>
     </w:p>
     <w:p>
@@ -2026,7 +1998,7 @@
           <w:sz w:val="21"/>
           <w:szCs w:val="21"/>
         </w:rPr>
-        <w:t xml:space="preserve">突破传统文档只能"阅读"的限制，让文档成为代码的执行环境。读者可以直接在文档中修改参数、运行代码、观察输出变化，实现真正的"交互式阅读"。这在技术教育、数据分析和算法演示场景中具有显著价值。</w:t>
+        <w:t xml:space="preserve">突破传统文档只能"阅读"的限制，让文档成为代码执行环境。读者可直接修改参数、运行代码、观察输出变化。</w:t>
       </w:r>
     </w:p>
     <w:p>
@@ -2058,7 +2030,7 @@
           <w:sz w:val="21"/>
           <w:szCs w:val="21"/>
         </w:rPr>
-        <w:t xml:space="preserve">通过 Pyodide（基于 WebAssembly 的 CPython 移植）实现在浏览器中运行 Python 代码，无需任何后端服务器或本地 Python 环境。这是纯前端架构的一大技术突破，确保了数据安全和零部署成本。</w:t>
+        <w:t xml:space="preserve">通过 Pyodide（基于 WebAssembly 的 CPython 移植）在浏览器中运行 Python，无需后端服务器或本地 Python 环境，零部署成本。</w:t>
       </w:r>
     </w:p>
     <w:p>
@@ -2090,7 +2062,7 @@
           <w:sz w:val="21"/>
           <w:szCs w:val="21"/>
         </w:rPr>
-        <w:t xml:space="preserve">文档不再是一成不变的快照。通过对接公开 API，文档中的图表可以自动刷新，展示最新的加密货币行情、天气预报、股票走势等实时数据。用户也可配置自定义 API 地址，实现任意数据源的接入。</w:t>
+        <w:t xml:space="preserve">文档中的图表可自动刷新，展示最新数据。用户可配置自定义 API 地址，接入任意数据源。</w:t>
       </w:r>
     </w:p>
     <w:p>
@@ -2122,7 +2094,7 @@
           <w:sz w:val="21"/>
           <w:szCs w:val="21"/>
         </w:rPr>
-        <w:t xml:space="preserve">不同于独立的文档查看工具，无界文档直接嵌入 Microsoft Word 侧边栏，用户无需切换应用即可获得增强体验。点击表格自动跳转对应图表、图表回写到 Word 文档等功能，实现了"原地增强"的无缝体验。</w:t>
+        <w:t xml:space="preserve">直接嵌入 Word 侧边栏，点击表格自动跳转图表、图表回写到 Word 等功能，实现"原地增强"体验。</w:t>
       </w:r>
     </w:p>
     <w:p>
@@ -2154,7 +2126,7 @@
           <w:sz w:val="21"/>
           <w:szCs w:val="21"/>
         </w:rPr>
-        <w:t xml:space="preserve">AI 对话不是简单的通用问答，而是基于文档全文上下文的智能分析。系统自动将所有块的内容组织为结构化上下文，使 AI 能够理解表格数据、代码逻辑、文本描述之间的关联，给出真正有针对性的回答。</w:t>
+        <w:t xml:space="preserve">AI 基于文档全文上下文回答问题，能理解表格数据、代码逻辑、文本描述之间的关联。</w:t>
       </w:r>
     </w:p>
     <w:p>
@@ -2184,162 +2156,97 @@
     </w:p>
     <w:p>
       <w:pPr>
-        <w:pStyle w:val="Heading2"/>
-        <w:spacing w:after="150" w:before="300"/>
-      </w:pPr>
-      <w:r>
-        <w:rPr>
-          <w:rFonts w:ascii="微软雅黑" w:cs="微软雅黑" w:eastAsia="微软雅黑" w:hAnsi="微软雅黑"/>
-          <w:b/>
-          <w:bCs/>
-          <w:color w:val="333333"/>
-          <w:sz w:val="26"/>
-          <w:szCs w:val="26"/>
-        </w:rPr>
-        <w:t xml:space="preserve">7.1 企业数据分析报告</w:t>
-      </w:r>
-    </w:p>
-    <w:p>
-      <w:pPr>
-        <w:spacing w:after="80" w:before="80"/>
-        <w:jc w:val="both"/>
-      </w:pPr>
-      <w:r>
-        <w:rPr>
-          <w:rFonts w:ascii="微软雅黑" w:cs="微软雅黑" w:eastAsia="微软雅黑" w:hAnsi="微软雅黑"/>
-          <w:color w:val="333333"/>
-          <w:sz w:val="21"/>
-          <w:szCs w:val="21"/>
-        </w:rPr>
-        <w:t xml:space="preserve">季度销售报告、市场分析报告等包含大量表格数据的文档。通过无界文档，表格自动转化为可交互图表，支持动态切换视图；实时数据块可接入内部 API 展示最新业务指标；AI 助手可帮助读者快速理解报告要点。</w:t>
-      </w:r>
-    </w:p>
-    <w:p>
-      <w:pPr>
-        <w:pStyle w:val="Heading2"/>
-        <w:spacing w:after="150" w:before="300"/>
-      </w:pPr>
-      <w:r>
-        <w:rPr>
-          <w:rFonts w:ascii="微软雅黑" w:cs="微软雅黑" w:eastAsia="微软雅黑" w:hAnsi="微软雅黑"/>
-          <w:b/>
-          <w:bCs/>
-          <w:color w:val="333333"/>
-          <w:sz w:val="26"/>
-          <w:szCs w:val="26"/>
-        </w:rPr>
-        <w:t xml:space="preserve">7.2 技术教育与教程</w:t>
-      </w:r>
-    </w:p>
-    <w:p>
-      <w:pPr>
-        <w:spacing w:after="80" w:before="80"/>
-        <w:jc w:val="both"/>
-      </w:pPr>
-      <w:r>
-        <w:rPr>
-          <w:rFonts w:ascii="微软雅黑" w:cs="微软雅黑" w:eastAsia="微软雅黑" w:hAnsi="微软雅黑"/>
-          <w:color w:val="333333"/>
-          <w:sz w:val="21"/>
-          <w:szCs w:val="21"/>
-        </w:rPr>
-        <w:t xml:space="preserve">编程教程、算法讲义等包含代码示例的文档。学生可直接在文档中运行代码、修改参数观察效果，实现"边读边练"。支持 JavaScript 和 Python 双语言。</w:t>
-      </w:r>
-    </w:p>
-    <w:p>
-      <w:pPr>
-        <w:pStyle w:val="Heading2"/>
-        <w:spacing w:after="150" w:before="300"/>
-      </w:pPr>
-      <w:r>
-        <w:rPr>
-          <w:rFonts w:ascii="微软雅黑" w:cs="微软雅黑" w:eastAsia="微软雅黑" w:hAnsi="微软雅黑"/>
-          <w:b/>
-          <w:bCs/>
-          <w:color w:val="333333"/>
-          <w:sz w:val="26"/>
-          <w:szCs w:val="26"/>
-        </w:rPr>
-        <w:t xml:space="preserve">7.3 科研论文与实验报告</w:t>
-      </w:r>
-    </w:p>
-    <w:p>
-      <w:pPr>
-        <w:spacing w:after="80" w:before="80"/>
-        <w:jc w:val="both"/>
-      </w:pPr>
-      <w:r>
-        <w:rPr>
-          <w:rFonts w:ascii="微软雅黑" w:cs="微软雅黑" w:eastAsia="微软雅黑" w:hAnsi="微软雅黑"/>
-          <w:color w:val="333333"/>
-          <w:sz w:val="21"/>
-          <w:szCs w:val="21"/>
-        </w:rPr>
-        <w:t xml:space="preserve">实验数据可视化、3D 模型展示（分子结构、机械零件等）。通过 3D 模型块，读者可自由旋转、缩放查看模型细节，比静态图片更加直观。</w:t>
-      </w:r>
-    </w:p>
-    <w:p>
-      <w:pPr>
-        <w:pStyle w:val="Heading2"/>
-        <w:spacing w:after="150" w:before="300"/>
-      </w:pPr>
-      <w:r>
-        <w:rPr>
-          <w:rFonts w:ascii="微软雅黑" w:cs="微软雅黑" w:eastAsia="微软雅黑" w:hAnsi="微软雅黑"/>
-          <w:b/>
-          <w:bCs/>
-          <w:color w:val="333333"/>
-          <w:sz w:val="26"/>
-          <w:szCs w:val="26"/>
-        </w:rPr>
-        <w:t xml:space="preserve">7.4 金融投资分析</w:t>
-      </w:r>
-    </w:p>
-    <w:p>
-      <w:pPr>
-        <w:spacing w:after="80" w:before="80"/>
-        <w:jc w:val="both"/>
-      </w:pPr>
-      <w:r>
-        <w:rPr>
-          <w:rFonts w:ascii="微软雅黑" w:cs="微软雅黑" w:eastAsia="微软雅黑" w:hAnsi="微软雅黑"/>
-          <w:color w:val="333333"/>
-          <w:sz w:val="21"/>
-          <w:szCs w:val="21"/>
-        </w:rPr>
-        <w:t xml:space="preserve">通过实时数据块接入加密货币、股票行情等 API，投资报告中的数据始终是最新的。读者无需手动刷新，图表自动更新。</w:t>
-      </w:r>
-    </w:p>
-    <w:p>
-      <w:pPr>
-        <w:pStyle w:val="Heading2"/>
-        <w:spacing w:after="150" w:before="300"/>
-      </w:pPr>
-      <w:r>
-        <w:rPr>
-          <w:rFonts w:ascii="微软雅黑" w:cs="微软雅黑" w:eastAsia="微软雅黑" w:hAnsi="微软雅黑"/>
-          <w:b/>
-          <w:bCs/>
-          <w:color w:val="333333"/>
-          <w:sz w:val="26"/>
-          <w:szCs w:val="26"/>
-        </w:rPr>
-        <w:t xml:space="preserve">7.5 产品需求文档</w:t>
-      </w:r>
-    </w:p>
-    <w:p>
-      <w:pPr>
-        <w:spacing w:after="80" w:before="80"/>
-        <w:jc w:val="both"/>
-      </w:pPr>
-      <w:r>
-        <w:rPr>
-          <w:rFonts w:ascii="微软雅黑" w:cs="微软雅黑" w:eastAsia="微软雅黑" w:hAnsi="微软雅黑"/>
-          <w:color w:val="333333"/>
-          <w:sz w:val="21"/>
-          <w:szCs w:val="21"/>
-        </w:rPr>
-        <w:t xml:space="preserve">产品经理可将 PRD 文档增强为包含原型图、数据看板、AI 问答的交互式文档，提升团队协作效率。</w:t>
+        <w:pStyle w:val="ListParagraph"/>
+        <w:numPr>
+          <w:ilvl w:val="0"/>
+          <w:numId w:val="1"/>
+        </w:numPr>
+        <w:spacing w:after="40" w:before="40"/>
+      </w:pPr>
+      <w:r>
+        <w:rPr>
+          <w:rFonts w:ascii="微软雅黑" w:cs="微软雅黑" w:eastAsia="微软雅黑" w:hAnsi="微软雅黑"/>
+          <w:color w:val="333333"/>
+          <w:sz w:val="21"/>
+          <w:szCs w:val="21"/>
+        </w:rPr>
+        <w:t xml:space="preserve">企业数据分析报告：表格自动转交互图表，实时数据块展示最新指标。</w:t>
+      </w:r>
+    </w:p>
+    <w:p>
+      <w:pPr>
+        <w:pStyle w:val="ListParagraph"/>
+        <w:numPr>
+          <w:ilvl w:val="0"/>
+          <w:numId w:val="1"/>
+        </w:numPr>
+        <w:spacing w:after="40" w:before="40"/>
+      </w:pPr>
+      <w:r>
+        <w:rPr>
+          <w:rFonts w:ascii="微软雅黑" w:cs="微软雅黑" w:eastAsia="微软雅黑" w:hAnsi="微软雅黑"/>
+          <w:color w:val="333333"/>
+          <w:sz w:val="21"/>
+          <w:szCs w:val="21"/>
+        </w:rPr>
+        <w:t xml:space="preserve">技术教育与教程：学生直接在文档中运行代码、修改参数，边读边练。</w:t>
+      </w:r>
+    </w:p>
+    <w:p>
+      <w:pPr>
+        <w:pStyle w:val="ListParagraph"/>
+        <w:numPr>
+          <w:ilvl w:val="0"/>
+          <w:numId w:val="1"/>
+        </w:numPr>
+        <w:spacing w:after="40" w:before="40"/>
+      </w:pPr>
+      <w:r>
+        <w:rPr>
+          <w:rFonts w:ascii="微软雅黑" w:cs="微软雅黑" w:eastAsia="微软雅黑" w:hAnsi="微软雅黑"/>
+          <w:color w:val="333333"/>
+          <w:sz w:val="21"/>
+          <w:szCs w:val="21"/>
+        </w:rPr>
+        <w:t xml:space="preserve">科研论文与实验报告：3D 模型可旋转缩放，比静态图片更直观。</w:t>
+      </w:r>
+    </w:p>
+    <w:p>
+      <w:pPr>
+        <w:pStyle w:val="ListParagraph"/>
+        <w:numPr>
+          <w:ilvl w:val="0"/>
+          <w:numId w:val="1"/>
+        </w:numPr>
+        <w:spacing w:after="40" w:before="40"/>
+      </w:pPr>
+      <w:r>
+        <w:rPr>
+          <w:rFonts w:ascii="微软雅黑" w:cs="微软雅黑" w:eastAsia="微软雅黑" w:hAnsi="微软雅黑"/>
+          <w:color w:val="333333"/>
+          <w:sz w:val="21"/>
+          <w:szCs w:val="21"/>
+        </w:rPr>
+        <w:t xml:space="preserve">金融投资分析：实时接入加密货币、股票行情 API，数据始终最新。</w:t>
+      </w:r>
+    </w:p>
+    <w:p>
+      <w:pPr>
+        <w:pStyle w:val="ListParagraph"/>
+        <w:numPr>
+          <w:ilvl w:val="0"/>
+          <w:numId w:val="1"/>
+        </w:numPr>
+        <w:spacing w:after="40" w:before="40"/>
+      </w:pPr>
+      <w:r>
+        <w:rPr>
+          <w:rFonts w:ascii="微软雅黑" w:cs="微软雅黑" w:eastAsia="微软雅黑" w:hAnsi="微软雅黑"/>
+          <w:color w:val="333333"/>
+          <w:sz w:val="21"/>
+          <w:szCs w:val="21"/>
+        </w:rPr>
+        <w:t xml:space="preserve">产品需求文档：增强为包含数据看板和 AI 问答的交互式文档。</w:t>
       </w:r>
     </w:p>
     <w:p>
@@ -3048,98 +2955,6 @@
           </w:p>
         </w:tc>
       </w:tr>
-      <w:tr>
-        <w:tc>
-          <w:tcPr>
-            <w:shd w:fill="F5F5FF" w:val="clear"/>
-          </w:tcPr>
-          <w:p>
-            <w:r>
-              <w:rPr>
-                <w:rFonts w:ascii="微软雅黑" w:cs="微软雅黑" w:eastAsia="微软雅黑" w:hAnsi="微软雅黑"/>
-                <w:b/>
-                <w:bCs/>
-                <w:color w:val="333333"/>
-                <w:sz w:val="18"/>
-                <w:szCs w:val="18"/>
-              </w:rPr>
-              <w:t xml:space="preserve">离线可用</w:t>
-            </w:r>
-          </w:p>
-        </w:tc>
-        <w:tc>
-          <w:p>
-            <w:pPr>
-              <w:jc w:val="center"/>
-            </w:pPr>
-            <w:r>
-              <w:rPr>
-                <w:rFonts w:ascii="微软雅黑" w:cs="微软雅黑" w:eastAsia="微软雅黑" w:hAnsi="微软雅黑"/>
-                <w:b w:val="false"/>
-                <w:bCs w:val="false"/>
-                <w:color w:val="333333"/>
-                <w:sz w:val="18"/>
-                <w:szCs w:val="18"/>
-              </w:rPr>
-              <w:t xml:space="preserve">⚠️ 除 AI 外</w:t>
-            </w:r>
-          </w:p>
-        </w:tc>
-        <w:tc>
-          <w:p>
-            <w:pPr>
-              <w:jc w:val="center"/>
-            </w:pPr>
-            <w:r>
-              <w:rPr>
-                <w:rFonts w:ascii="微软雅黑" w:cs="微软雅黑" w:eastAsia="微软雅黑" w:hAnsi="微软雅黑"/>
-                <w:b w:val="false"/>
-                <w:bCs w:val="false"/>
-                <w:color w:val="333333"/>
-                <w:sz w:val="18"/>
-                <w:szCs w:val="18"/>
-              </w:rPr>
-              <w:t xml:space="preserve">❌ 需联网</w:t>
-            </w:r>
-          </w:p>
-        </w:tc>
-        <w:tc>
-          <w:p>
-            <w:pPr>
-              <w:jc w:val="center"/>
-            </w:pPr>
-            <w:r>
-              <w:rPr>
-                <w:rFonts w:ascii="微软雅黑" w:cs="微软雅黑" w:eastAsia="微软雅黑" w:hAnsi="微软雅黑"/>
-                <w:b w:val="false"/>
-                <w:bCs w:val="false"/>
-                <w:color w:val="333333"/>
-                <w:sz w:val="18"/>
-                <w:szCs w:val="18"/>
-              </w:rPr>
-              <w:t xml:space="preserve">✅ 可离线</w:t>
-            </w:r>
-          </w:p>
-        </w:tc>
-        <w:tc>
-          <w:p>
-            <w:pPr>
-              <w:jc w:val="center"/>
-            </w:pPr>
-            <w:r>
-              <w:rPr>
-                <w:rFonts w:ascii="微软雅黑" w:cs="微软雅黑" w:eastAsia="微软雅黑" w:hAnsi="微软雅黑"/>
-                <w:b w:val="false"/>
-                <w:bCs w:val="false"/>
-                <w:color w:val="333333"/>
-                <w:sz w:val="18"/>
-                <w:szCs w:val="18"/>
-              </w:rPr>
-              <w:t xml:space="preserve">✅ 可离线</w:t>
-            </w:r>
-          </w:p>
-        </w:tc>
-      </w:tr>
     </w:tbl>
     <w:p>
       <w:pPr>
@@ -3168,7 +2983,7 @@
           <w:sz w:val="21"/>
           <w:szCs w:val="21"/>
         </w:rPr>
-        <w:t xml:space="preserve">无界文档的独特优势在于：它是唯一一个同时实现 Word 深度集成、多语言代码执行、实时数据、3D 可视化和 AI 问答的产品，且采用纯前端架构，零部署成本。</w:t>
+        <w:t xml:space="preserve">无界文档是唯一同时实现 Word 深度集成、多语言代码执行、实时数据、3D 可视化和 AI 问答的产品，且纯前端架构零部署成本。</w:t>
       </w:r>
     </w:p>
     <w:p>
@@ -3210,7 +3025,7 @@
           <w:sz w:val="26"/>
           <w:szCs w:val="26"/>
         </w:rPr>
-        <w:t xml:space="preserve">9.1 短期目标（1-3 个月）</w:t>
+        <w:t xml:space="preserve">短期（1-3 个月）</w:t>
       </w:r>
     </w:p>
     <w:p>
@@ -3248,7 +3063,7 @@
           <w:sz w:val="21"/>
           <w:szCs w:val="21"/>
         </w:rPr>
-        <w:t xml:space="preserve">更多图表类型：雷达图、热力图、桑基图等高级可视化。</w:t>
+        <w:t xml:space="preserve">更多图表类型：雷达图、热力图、桑基图等。</w:t>
       </w:r>
     </w:p>
     <w:p>
@@ -3267,7 +3082,7 @@
           <w:sz w:val="21"/>
           <w:szCs w:val="21"/>
         </w:rPr>
-        <w:t xml:space="preserve">自定义 GLB/OBJ 模型上传：支持用户上传自己的 3D 模型文件。</w:t>
+        <w:t xml:space="preserve">自定义 3D 模型上传：支持用户上传 GLB/OBJ 文件。</w:t>
       </w:r>
     </w:p>
     <w:p>
@@ -3286,7 +3101,7 @@
           <w:sz w:val="21"/>
           <w:szCs w:val="21"/>
         </w:rPr>
-        <w:t xml:space="preserve">导出功能：将增强后的文档导出为独立的 HTML 文件，无需服务器即可查看。</w:t>
+        <w:t xml:space="preserve">导出为独立 HTML：无需服务器即可查看增强文档。</w:t>
       </w:r>
     </w:p>
     <w:p>
@@ -3303,7 +3118,7 @@
           <w:sz w:val="26"/>
           <w:szCs w:val="26"/>
         </w:rPr>
-        <w:t xml:space="preserve">9.2 中期目标（3-6 个月）</w:t>
+        <w:t xml:space="preserve">中期（3-6 个月）</w:t>
       </w:r>
     </w:p>
     <w:p>
@@ -3322,7 +3137,7 @@
           <w:sz w:val="21"/>
           <w:szCs w:val="21"/>
         </w:rPr>
-        <w:t xml:space="preserve">PPT 插件：将增强能力扩展到 PowerPoint，支持动态图表和实时数据嵌入幻灯片。</w:t>
+        <w:t xml:space="preserve">PPT 插件：增强能力扩展到 PowerPoint。</w:t>
       </w:r>
     </w:p>
     <w:p>
@@ -3341,7 +3156,7 @@
           <w:sz w:val="21"/>
           <w:szCs w:val="21"/>
         </w:rPr>
-        <w:t xml:space="preserve">模板市场：提供行业模板（财报、论文、教案等），用户可快速创建增强文档。</w:t>
+        <w:t xml:space="preserve">模板市场：提供行业模板快速创建增强文档。</w:t>
       </w:r>
     </w:p>
     <w:p>
@@ -3360,7 +3175,24 @@
           <w:sz w:val="21"/>
           <w:szCs w:val="21"/>
         </w:rPr>
-        <w:t xml:space="preserve">数据源管理：可视化配置 API 数据源，支持 OAuth 认证、数据缓存和错误重试。</w:t>
+        <w:t xml:space="preserve">数据源管理：可视化配置 API，支持 OAuth 认证。</w:t>
+      </w:r>
+    </w:p>
+    <w:p>
+      <w:pPr>
+        <w:pStyle w:val="Heading2"/>
+        <w:spacing w:after="150" w:before="300"/>
+      </w:pPr>
+      <w:r>
+        <w:rPr>
+          <w:rFonts w:ascii="微软雅黑" w:cs="微软雅黑" w:eastAsia="微软雅黑" w:hAnsi="微软雅黑"/>
+          <w:b/>
+          <w:bCs/>
+          <w:color w:val="333333"/>
+          <w:sz w:val="26"/>
+          <w:szCs w:val="26"/>
+        </w:rPr>
+        <w:t xml:space="preserve">长期（6-12 个月）</w:t>
       </w:r>
     </w:p>
     <w:p>
@@ -3379,24 +3211,7 @@
           <w:sz w:val="21"/>
           <w:szCs w:val="21"/>
         </w:rPr>
-        <w:t xml:space="preserve">R 语言支持：在代码块中增加 R 语言执行能力。</w:t>
-      </w:r>
-    </w:p>
-    <w:p>
-      <w:pPr>
-        <w:pStyle w:val="Heading2"/>
-        <w:spacing w:after="150" w:before="300"/>
-      </w:pPr>
-      <w:r>
-        <w:rPr>
-          <w:rFonts w:ascii="微软雅黑" w:cs="微软雅黑" w:eastAsia="微软雅黑" w:hAnsi="微软雅黑"/>
-          <w:b/>
-          <w:bCs/>
-          <w:color w:val="333333"/>
-          <w:sz w:val="26"/>
-          <w:szCs w:val="26"/>
-        </w:rPr>
-        <w:t xml:space="preserve">9.3 长期愿景（6-12 个月）</w:t>
+        <w:t xml:space="preserve">AI 自动增强：AI 自动识别文档内容并生成增强建议。</w:t>
       </w:r>
     </w:p>
     <w:p>
@@ -3415,7 +3230,7 @@
           <w:sz w:val="21"/>
           <w:szCs w:val="21"/>
         </w:rPr>
-        <w:t xml:space="preserve">AI 自动增强：AI 自动识别文档中的表格、数据和代码，一键生成增强建议。</w:t>
+        <w:t xml:space="preserve">企业私有部署：Docker 镜像和 K8s Helm Chart。</w:t>
       </w:r>
     </w:p>
     <w:p>
@@ -3434,45 +3249,7 @@
           <w:sz w:val="21"/>
           <w:szCs w:val="21"/>
         </w:rPr>
-        <w:t xml:space="preserve">企业私有部署：提供 Docker 镜像和 K8s Helm Chart，支持企业内网私有部署。</w:t>
-      </w:r>
-    </w:p>
-    <w:p>
-      <w:pPr>
-        <w:pStyle w:val="ListParagraph"/>
-        <w:numPr>
-          <w:ilvl w:val="0"/>
-          <w:numId w:val="1"/>
-        </w:numPr>
-        <w:spacing w:after="40" w:before="40"/>
-      </w:pPr>
-      <w:r>
-        <w:rPr>
-          <w:rFonts w:ascii="微软雅黑" w:cs="微软雅黑" w:eastAsia="微软雅黑" w:hAnsi="微软雅黑"/>
-          <w:color w:val="333333"/>
-          <w:sz w:val="21"/>
-          <w:szCs w:val="21"/>
-        </w:rPr>
-        <w:t xml:space="preserve">插件生态：开放块类型 API，允许第三方开发者创建自定义块类型。</w:t>
-      </w:r>
-    </w:p>
-    <w:p>
-      <w:pPr>
-        <w:pStyle w:val="ListParagraph"/>
-        <w:numPr>
-          <w:ilvl w:val="0"/>
-          <w:numId w:val="1"/>
-        </w:numPr>
-        <w:spacing w:after="40" w:before="40"/>
-      </w:pPr>
-      <w:r>
-        <w:rPr>
-          <w:rFonts w:ascii="微软雅黑" w:cs="微软雅黑" w:eastAsia="微软雅黑" w:hAnsi="微软雅黑"/>
-          <w:color w:val="333333"/>
-          <w:sz w:val="21"/>
-          <w:szCs w:val="21"/>
-        </w:rPr>
-        <w:t xml:space="preserve">移动端适配：响应式布局优化，支持在手机和平板上查看增强文档。</w:t>
+        <w:t xml:space="preserve">插件生态：开放块类型 API，第三方开发者可创建自定义块。</w:t>
       </w:r>
     </w:p>
     <w:p>
@@ -3527,7 +3304,7 @@
           <w:sz w:val="21"/>
           <w:szCs w:val="21"/>
         </w:rPr>
-        <w:t xml:space="preserve">产品采用纯前端架构（React + TypeScript + Vite），所有计算在浏览器端完成，零部署成本。同时作为 Microsoft Word 官方插件，实现了与 Word 的深度集成，用户无需离开熟悉的编辑环境即可获得增强体验。</w:t>
+        <w:t xml:space="preserve">产品采用纯前端架构（React + TypeScript + Vite），所有计算在浏览器端完成，零部署成本。同时作为 Microsoft Word 官方插件，实现了与 Word 的深度集成。</w:t>
       </w:r>
     </w:p>
     <w:p>
@@ -3544,17 +3321,46 @@
           <w:sz w:val="21"/>
           <w:szCs w:val="21"/>
         </w:rPr>
-        <w:t xml:space="preserve">我们相信，文档不应只是信息的容器，更应是探索、交互和智能分析的平台。无界文档，让每份文档都"活"起来。</w:t>
-      </w:r>
-    </w:p>
-    <w:p>
-      <w:pPr>
-        <w:spacing w:before="600"/>
+        <w:t xml:space="preserve">我们相信，文档不应只是信息的容器，更应是探索、交互和智能分析的平台。</w:t>
+      </w:r>
+    </w:p>
+    <w:p>
+      <w:pPr>
+        <w:spacing w:before="400"/>
         <w:jc w:val="center"/>
       </w:pPr>
     </w:p>
     <w:p>
       <w:pPr>
+        <w:jc w:val="center"/>
+      </w:pPr>
+      <w:r>
+        <w:rPr>
+          <w:rFonts w:ascii="Consolas" w:cs="Consolas" w:eastAsia="Consolas" w:hAnsi="Consolas"/>
+          <w:color w:val="6C63FF"/>
+          <w:sz w:val="18"/>
+          <w:szCs w:val="18"/>
+        </w:rPr>
+        <w:t xml:space="preserve">在线体验：https://pigeon-soft.github.io/boundless-doc/</w:t>
+      </w:r>
+    </w:p>
+    <w:p>
+      <w:pPr>
+        <w:jc w:val="center"/>
+      </w:pPr>
+      <w:r>
+        <w:rPr>
+          <w:rFonts w:ascii="Consolas" w:cs="Consolas" w:eastAsia="Consolas" w:hAnsi="Consolas"/>
+          <w:color w:val="6C63FF"/>
+          <w:sz w:val="18"/>
+          <w:szCs w:val="18"/>
+        </w:rPr>
+        <w:t xml:space="preserve">开源仓库：https://github.com/PIGEON-SOFT/boundless-doc</w:t>
+      </w:r>
+    </w:p>
+    <w:p>
+      <w:pPr>
+        <w:spacing w:before="200"/>
         <w:jc w:val="center"/>
       </w:pPr>
       <w:r>
@@ -3714,7 +3520,7 @@
         <w:sz w:val="16"/>
         <w:szCs w:val="16"/>
       </w:rPr>
-      <w:t xml:space="preserve">无界文档 π — 产品方案</w:t>
+      <w:t xml:space="preserve">无界文档 π — 产品方案 v1.0</w:t>
     </w:r>
   </w:p>
 </w:hdr>

</xml_diff>